<commit_message>
The notebook lives in Journaler; paper becomes an accommodation
Paper was offered four times as an equal option -- "completely fine", "works too" --
which invites the version of this that is worst for everyone: forty handwritten
entries scanned in December, hand-numbered, with a Contents list built by hand,
against a rubric that wants dates, numbers, word counts and opening lines.

Journaler does all of that automatically, so it is the home now. The door stays
open for anyone who needs it -- "if a computer is a real barrier for you, come talk
to me" -- as an accommodation rather than an invitation.

Four places: three in the guidelines, one on the public course page.

Co-Authored-By: Claude Opus 5 (1M context) <noreply@anthropic.com>
</commit_message>
<xml_diff>
--- a/writers-notebook/Writers Notebook Guidelines.docx
+++ b/writers-notebook/Writers Notebook Guidelines.docx
@@ -385,27 +385,7 @@
           <w:bCs w:val="1"/>
           <w:rtl w:val="0"/>
         </w:rPr>
-        <w:t xml:space="preserve">Journaler</w:t>
-      </w:r>
-      <w:r>
-        <w:rPr>
-          <w:rtl w:val="0"/>
-        </w:rPr>
-        <w:t xml:space="preserve"> is the recommended home and makes turning it in one click. A physical notebook is completely fine — photograph or scan it. The one exception is the five </w:t>
-      </w:r>
-      <w:r>
-        <w:rPr>
-          <w:b w:val="1"/>
-          <w:bCs w:val="1"/>
-          <w:rtl w:val="0"/>
-        </w:rPr>
-        <w:t xml:space="preserve">timed One-Pager drafts</w:t>
-      </w:r>
-      <w:r>
-        <w:rPr>
-          <w:rtl w:val="0"/>
-        </w:rPr>
-        <w:t xml:space="preserve">, which happen in Journaler because the edit-lock is what keeps a timed draft honest.</w:t>
+        <w:t xml:space="preserve">Keep it in Journaler. It dates and numbers your entries as you go, builds the Contents list for you, and turns the whole thing in with one click — none of which you want to be doing by hand in December. The five timed One-Pager drafts happen there too, because the edit-lock is what keeps a timed draft honest. If a computer is a real barrier for you, come talk to me and we will work something out.</w:t>
       </w:r>
     </w:p>
     <w:p>
@@ -428,21 +408,7 @@
         <w:rPr>
           <w:rtl w:val="0"/>
         </w:rPr>
-        <w:t xml:space="preserve">Every notebook is turned in the same way, whether you kept it in Journaler or on paper. Journaler produces this for you when you choose </w:t>
-      </w:r>
-      <w:r>
-        <w:rPr>
-          <w:b w:val="1"/>
-          <w:bCs w:val="1"/>
-          <w:rtl w:val="0"/>
-        </w:rPr>
-        <w:t xml:space="preserve">Bundle → PDF</w:t>
-      </w:r>
-      <w:r>
-        <w:rPr>
-          <w:rtl w:val="0"/>
-        </w:rPr>
-        <w:t xml:space="preserve">. On paper, you produce it yourself. Three things:</w:t>
+        <w:t xml:space="preserve">Journaler produces all of this for you when you choose Bundle → PDF. Three things every notebook has:</w:t>
       </w:r>
     </w:p>
     <w:p>
@@ -548,7 +514,7 @@
         <w:rPr>
           <w:rtl w:val="0"/>
         </w:rPr>
-        <w:t xml:space="preserve">If you keep a paper notebook, number your entries as you go rather than at the end. Numbering forty entries in December is an evening you will not enjoy.</w:t>
+        <w:t xml:space="preserve"/>
       </w:r>
     </w:p>
     <w:p>

</xml_diff>

<commit_message>
Notebook wording: now published in Canvas; 20 or more entries
Plus a How to Reach 20 or More section in the guidelines, so the count is arithmetic
rather than a mystery: 27 class meetings, the four required pages, the currere
movements, the Look-Back Letter -- and the five timed One-Pager gushes explicitly
not counted.

Co-Authored-By: Claude Opus 5 (1M context) <noreply@anthropic.com>
</commit_message>
<xml_diff>
--- a/writers-notebook/Writers Notebook Guidelines.docx
+++ b/writers-notebook/Writers Notebook Guidelines.docx
@@ -121,21 +121,7 @@
         <w:rPr>
           <w:rtl w:val="0"/>
         </w:rPr>
-        <w:t xml:space="preserve">You will write in it in nearly every class and on your own. Expect </w:t>
-      </w:r>
-      <w:r>
-        <w:rPr>
-          <w:b w:val="1"/>
-          <w:bCs w:val="1"/>
-          <w:rtl w:val="0"/>
-        </w:rPr>
-        <w:t xml:space="preserve">25 to 40 entries</w:t>
-      </w:r>
-      <w:r>
-        <w:rPr>
-          <w:rtl w:val="0"/>
-        </w:rPr>
-        <w:t xml:space="preserve"> by December.</w:t>
+        <w:t xml:space="preserve">You will write in it in nearly every class and on your own. Expect 20 or more entries by December — typically one per class meeting.</w:t>
       </w:r>
     </w:p>
     <w:p>
@@ -361,6 +347,170 @@
           <w:rtl w:val="0"/>
         </w:rPr>
         <w:t xml:space="preserve"> Each one is submitted on sheet two of the One-Pager PDF it produced. It is the same writing either way, and it belongs with the piece it became. Nothing gets counted twice.</w:t>
+      </w:r>
+    </w:p>
+    <w:p>
+      <w:pPr>
+        <w:pStyle w:val="Heading2"/>
+        <w:rPr/>
+      </w:pPr>
+      <w:r>
+        <w:rPr>
+          <w:rtl w:val="0"/>
+        </w:rPr>
+        <w:t xml:space="preserve">How to Reach 20 or More</w:t>
+      </w:r>
+    </w:p>
+    <w:p>
+      <w:pPr>
+        <w:numPr>
+          <w:ilvl w:val="0"/>
+          <w:numId w:val="1"/>
+        </w:numPr>
+        <w:spacing w:after="0" w:afterAutospacing="0"/>
+        <w:ind w:left="720" w:hanging="360"/>
+        <w:rPr>
+          <w:u w:val="none"/>
+        </w:rPr>
+      </w:pPr>
+      <w:r>
+        <w:rPr>
+          <w:u w:val="none"/>
+        </w:rPr>
+        <w:t xml:space="preserve">We meet 27 times this term. One kept entry per meeting clears 20 on its own — the rest is what you write on your own.</w:t>
+      </w:r>
+    </w:p>
+    <w:p>
+      <w:pPr>
+        <w:numPr>
+          <w:ilvl w:val="0"/>
+          <w:numId w:val="1"/>
+        </w:numPr>
+        <w:spacing w:after="0" w:afterAutospacing="0"/>
+        <w:ind w:left="720" w:hanging="360"/>
+        <w:rPr>
+          <w:u w:val="none"/>
+        </w:rPr>
+      </w:pPr>
+      <w:r>
+        <w:rPr>
+          <w:u w:val="none"/>
+        </w:rPr>
+        <w:t xml:space="preserve">In-class writing, most meetings — the daily opener, quick-writes, exercises: roughly 18–25</w:t>
+      </w:r>
+    </w:p>
+    <w:p>
+      <w:pPr>
+        <w:numPr>
+          <w:ilvl w:val="0"/>
+          <w:numId w:val="1"/>
+        </w:numPr>
+        <w:spacing w:after="0" w:afterAutospacing="0"/>
+        <w:ind w:left="720" w:hanging="360"/>
+        <w:rPr>
+          <w:u w:val="none"/>
+        </w:rPr>
+      </w:pPr>
+      <w:r>
+        <w:rPr>
+          <w:u w:val="none"/>
+        </w:rPr>
+        <w:t xml:space="preserve">The Week 1 baseline, why do we write?: 1</w:t>
+      </w:r>
+    </w:p>
+    <w:p>
+      <w:pPr>
+        <w:numPr>
+          <w:ilvl w:val="0"/>
+          <w:numId w:val="1"/>
+        </w:numPr>
+        <w:spacing w:after="0" w:afterAutospacing="0"/>
+        <w:ind w:left="720" w:hanging="360"/>
+        <w:rPr>
+          <w:u w:val="none"/>
+        </w:rPr>
+      </w:pPr>
+      <w:r>
+        <w:rPr>
+          <w:u w:val="none"/>
+        </w:rPr>
+        <w:t xml:space="preserve">The four currere movements, plus brainstorms and storyboard notes: 4–6</w:t>
+      </w:r>
+    </w:p>
+    <w:p>
+      <w:pPr>
+        <w:numPr>
+          <w:ilvl w:val="0"/>
+          <w:numId w:val="1"/>
+        </w:numPr>
+        <w:spacing w:after="0" w:afterAutospacing="0"/>
+        <w:ind w:left="720" w:hanging="360"/>
+        <w:rPr>
+          <w:u w:val="none"/>
+        </w:rPr>
+      </w:pPr>
+      <w:r>
+        <w:rPr>
+          <w:u w:val="none"/>
+        </w:rPr>
+        <w:t xml:space="preserve">Your topic map and your source notes: 2</w:t>
+      </w:r>
+    </w:p>
+    <w:p>
+      <w:pPr>
+        <w:numPr>
+          <w:ilvl w:val="0"/>
+          <w:numId w:val="1"/>
+        </w:numPr>
+        <w:spacing w:after="0" w:afterAutospacing="0"/>
+        <w:ind w:left="720" w:hanging="360"/>
+        <w:rPr>
+          <w:u w:val="none"/>
+        </w:rPr>
+      </w:pPr>
+      <w:r>
+        <w:rPr>
+          <w:u w:val="none"/>
+        </w:rPr>
+        <w:t xml:space="preserve">The Week 15 Look-Back Letter: 1</w:t>
+      </w:r>
+    </w:p>
+    <w:p>
+      <w:pPr>
+        <w:numPr>
+          <w:ilvl w:val="0"/>
+          <w:numId w:val="1"/>
+        </w:numPr>
+        <w:spacing w:after="0" w:afterAutospacing="0"/>
+        <w:ind w:left="720" w:hanging="360"/>
+        <w:rPr>
+          <w:u w:val="none"/>
+        </w:rPr>
+      </w:pPr>
+      <w:r>
+        <w:rPr>
+          <w:u w:val="none"/>
+        </w:rPr>
+        <w:t xml:space="preserve">Anything you keep on your own — an overheard line, a false start, a question you cannot drop</w:t>
+      </w:r>
+    </w:p>
+    <w:p>
+      <w:pPr>
+        <w:numPr>
+          <w:ilvl w:val="0"/>
+          <w:numId w:val="1"/>
+        </w:numPr>
+        <w:spacing w:after="0" w:afterAutospacing="0"/>
+        <w:ind w:left="720" w:hanging="360"/>
+        <w:rPr>
+          <w:u w:val="none"/>
+        </w:rPr>
+      </w:pPr>
+      <w:r>
+        <w:rPr>
+          <w:u w:val="none"/>
+        </w:rPr>
+        <w:t xml:space="preserve">The five timed One-Pager gushes are not counted here; they ride with the piece they became.</w:t>
       </w:r>
     </w:p>
     <w:p>

</xml_diff>

<commit_message>
The rubric says 20 too, the way the rest of the handout does
The handout said 20 or more three times in its prose — "Expect 20 or
more entries by December", "How to Reach 20 or More", "One kept entry
per meeting clears 20 on its own" — while its own rubric table still
banded at 25 full and 15 partial. The table was never updated when the
prose was rewritten, so the document contradicted itself.

Bands are now 20 full, 12–19 partial, under 12 nothing, matching
ENTRIES_BANDS in Journaler, which is what students have actually been
shown all term.

Co-Authored-By: Claude Opus 5 (1M context) <noreply@anthropic.com>
</commit_message>
<xml_diff>
--- a/writers-notebook/Writers Notebook Guidelines.docx
+++ b/writers-notebook/Writers Notebook Guidelines.docx
@@ -1863,63 +1863,63 @@
               <w:rPr>
                 <w:rtl w:val="0"/>
               </w:rPr>
-              <w:t xml:space="preserve">25 or more dated entries, spread across the whole term at roughly one per session. The notebook shows a habit: you wrote when it was going well and when it was not.</w:t>
-            </w:r>
-          </w:p>
-        </w:tc>
-        <w:tc>
-          <w:tcPr>
-            <w:tcBorders>
-              <w:top w:color="000000" w:space="0" w:sz="4" w:val="single"/>
-              <w:left w:color="000000" w:space="0" w:sz="4" w:val="single"/>
-              <w:bottom w:color="000000" w:space="0" w:sz="4" w:val="single"/>
-              <w:right w:color="000000" w:space="0" w:sz="4" w:val="single"/>
-            </w:tcBorders>
-            <w:tcMar>
-              <w:top w:w="40.0" w:type="dxa"/>
-              <w:left w:w="108.0" w:type="dxa"/>
-              <w:bottom w:w="40.0" w:type="dxa"/>
-              <w:right w:w="108.0" w:type="dxa"/>
-            </w:tcMar>
-          </w:tcPr>
-          <w:p>
-            <w:pPr>
-              <w:spacing w:after="0"/>
-              <w:rPr/>
-            </w:pPr>
-            <w:r>
-              <w:rPr>
-                <w:rtl w:val="0"/>
-              </w:rPr>
-              <w:t xml:space="preserve">15–24 entries, or the term is uneven — long silences, or a stretch written all at once. Twenty-eight entries dated in November is not a practice.</w:t>
-            </w:r>
-          </w:p>
-        </w:tc>
-        <w:tc>
-          <w:tcPr>
-            <w:tcBorders>
-              <w:top w:color="000000" w:space="0" w:sz="4" w:val="single"/>
-              <w:left w:color="000000" w:space="0" w:sz="4" w:val="single"/>
-              <w:bottom w:color="000000" w:space="0" w:sz="4" w:val="single"/>
-              <w:right w:color="000000" w:space="0" w:sz="4" w:val="single"/>
-            </w:tcBorders>
-            <w:tcMar>
-              <w:top w:w="40.0" w:type="dxa"/>
-              <w:left w:w="108.0" w:type="dxa"/>
-              <w:bottom w:w="40.0" w:type="dxa"/>
-              <w:right w:w="108.0" w:type="dxa"/>
-            </w:tcMar>
-          </w:tcPr>
-          <w:p>
-            <w:pPr>
-              <w:spacing w:after="0"/>
-              <w:rPr/>
-            </w:pPr>
-            <w:r>
-              <w:rPr>
-                <w:rtl w:val="0"/>
-              </w:rPr>
-              <w:t xml:space="preserve">Fewer than 15 entries, or nothing dated, so no practice can be seen.</w:t>
+              <w:t xml:space="preserve">20 or more dated entries, spread across the whole term at roughly one per session. The notebook shows a habit: you wrote when it was going well and when it was not.</w:t>
+            </w:r>
+          </w:p>
+        </w:tc>
+        <w:tc>
+          <w:tcPr>
+            <w:tcBorders>
+              <w:top w:color="000000" w:space="0" w:sz="4" w:val="single"/>
+              <w:left w:color="000000" w:space="0" w:sz="4" w:val="single"/>
+              <w:bottom w:color="000000" w:space="0" w:sz="4" w:val="single"/>
+              <w:right w:color="000000" w:space="0" w:sz="4" w:val="single"/>
+            </w:tcBorders>
+            <w:tcMar>
+              <w:top w:w="40.0" w:type="dxa"/>
+              <w:left w:w="108.0" w:type="dxa"/>
+              <w:bottom w:w="40.0" w:type="dxa"/>
+              <w:right w:w="108.0" w:type="dxa"/>
+            </w:tcMar>
+          </w:tcPr>
+          <w:p>
+            <w:pPr>
+              <w:spacing w:after="0"/>
+              <w:rPr/>
+            </w:pPr>
+            <w:r>
+              <w:rPr>
+                <w:rtl w:val="0"/>
+              </w:rPr>
+              <w:t xml:space="preserve">12–19 entries, or the term is uneven — long silences, or a stretch written all at once. Twenty-eight entries dated in November is not a practice.</w:t>
+            </w:r>
+          </w:p>
+        </w:tc>
+        <w:tc>
+          <w:tcPr>
+            <w:tcBorders>
+              <w:top w:color="000000" w:space="0" w:sz="4" w:val="single"/>
+              <w:left w:color="000000" w:space="0" w:sz="4" w:val="single"/>
+              <w:bottom w:color="000000" w:space="0" w:sz="4" w:val="single"/>
+              <w:right w:color="000000" w:space="0" w:sz="4" w:val="single"/>
+            </w:tcBorders>
+            <w:tcMar>
+              <w:top w:w="40.0" w:type="dxa"/>
+              <w:left w:w="108.0" w:type="dxa"/>
+              <w:bottom w:w="40.0" w:type="dxa"/>
+              <w:right w:w="108.0" w:type="dxa"/>
+            </w:tcMar>
+          </w:tcPr>
+          <w:p>
+            <w:pPr>
+              <w:spacing w:after="0"/>
+              <w:rPr/>
+            </w:pPr>
+            <w:r>
+              <w:rPr>
+                <w:rtl w:val="0"/>
+              </w:rPr>
+              <w:t xml:space="preserve">Fewer than 12 entries, or nothing dated, so no practice can be seen.</w:t>
             </w:r>
           </w:p>
         </w:tc>

</xml_diff>